<commit_message>
docs: give the Figure Record its own requirement (URS-VIZ-09)
The figure record and the shaded partial AUC intervals were tested against
URS-VIZ-08, which is about dose normalisation, so three tests sat under a
requirement they do not exercise. URS-VIZ-09 now states what the Figure Record
must contain and that the script reproduces the shading; REC-08, PAUC-17 and
MAN-49 point at it. The URS also names the partial AUC capability in the
system description and cites the EMA modified release guideline. 63
requirements, all traced; protocol regenerated.

Co-Authored-By: Claude Opus 5 <noreply@anthropic.com>
</commit_message>
<xml_diff>
--- a/validation/NCA_Assistant_URS.docx
+++ b/validation/NCA_Assistant_URS.docx
@@ -424,7 +424,7 @@
           <w:sz w:val="22"/>
           <w:szCs w:val="22"/>
         </w:rPr>
-        <w:t>This URS covers 62 requirements across 8 categories: General (5), Data Handling (7), NCA (14), Bioequivalence (10), Power (6), Export (8), Usability (4), and Visualization (8).</w:t>
+        <w:t>This URS covers 63 requirements across 8 categories: General (5), Data Handling (7), NCA (14), Bioequivalence (10), Power (6), Export (8), Usability (4), and Visualization (9).</w:t>
       </w:r>
     </w:p>
     <w:p>
@@ -448,7 +448,7 @@
           <w:sz w:val="22"/>
           <w:szCs w:val="22"/>
         </w:rPr>
-        <w:t>NCA Assistant v1.5.0 provides six workflow paths accessible from a central hub: (1) Plan a Study, (2) Upload &amp; Check Data (flat files, or CDISC ADNCA datasets through a separate upload option), (3) Visualize Data, (4) Analyze One Subject at a Time, (5) Analyze All Subjects, (6) Bioequivalence Testing. The data-processing pipeline (R/pipeline.R) is shared by the app, the validation script and the reproduction scripts shipped in every Analysis Record. GAMP 5 Category 5 custom application. The app performs average bioequivalence only; it does not perform reference-scaled (ABEL, RSABE) or NTID analyses, which Plan a Study can plan. It is not affiliated with, endorsed by, or certified by CDISC.</w:t>
+        <w:t>NCA Assistant v1.5.0 provides six workflow paths accessible from a central hub: (1) Plan a Study, (2) Upload &amp; Check Data (flat files, or CDISC ADNCA datasets through a separate upload option), (3) Visualize Data, (4) Analyze One Subject at a Time, (5) Analyze All Subjects, (6) Bioequivalence Testing. Paths 4, 5 and 6 also report partial AUCs over intervals entered by the user, and path 6 compares them. The data-processing pipeline (R/pipeline.R) is shared by the app, the validation script and the reproduction scripts shipped in every Analysis Record. GAMP 5 Category 5 custom application. The app performs average bioequivalence only; it does not perform reference-scaled (ABEL, RSABE) or NTID analyses, which Plan a Study can plan. It is not affiliated with, endorsed by, or certified by CDISC.</w:t>
       </w:r>
     </w:p>
     <w:p>
@@ -12771,6 +12771,197 @@
           </w:p>
         </w:tc>
       </w:tr>
+      <w:tr>
+        <w:tc>
+          <w:tcPr>
+            <w:tcW w:type="dxa" w:w="1200"/>
+            <w:tcBorders>
+              <w:top w:val="single" w:color="999999" w:sz="1"/>
+              <w:left w:val="single" w:color="999999" w:sz="1"/>
+              <w:bottom w:val="single" w:color="999999" w:sz="1"/>
+              <w:right w:val="single" w:color="999999" w:sz="1"/>
+            </w:tcBorders>
+            <w:tcMar>
+              <w:top w:type="dxa" w:w="60"/>
+              <w:left w:type="dxa" w:w="100"/>
+              <w:bottom w:type="dxa" w:w="60"/>
+              <w:right w:type="dxa" w:w="100"/>
+            </w:tcMar>
+          </w:tcPr>
+          <w:p>
+            <w:r>
+              <w:rPr>
+                <w:rFonts w:ascii="Arial" w:cs="Arial" w:eastAsia="Arial" w:hAnsi="Arial"/>
+                <w:sz w:val="20"/>
+                <w:szCs w:val="20"/>
+              </w:rPr>
+              <w:t>FM-VIZ-09</w:t>
+            </w:r>
+          </w:p>
+        </w:tc>
+        <w:tc>
+          <w:tcPr>
+            <w:tcW w:type="dxa" w:w="3160"/>
+            <w:tcBorders>
+              <w:top w:val="single" w:color="999999" w:sz="1"/>
+              <w:left w:val="single" w:color="999999" w:sz="1"/>
+              <w:bottom w:val="single" w:color="999999" w:sz="1"/>
+              <w:right w:val="single" w:color="999999" w:sz="1"/>
+            </w:tcBorders>
+            <w:tcMar>
+              <w:top w:type="dxa" w:w="60"/>
+              <w:left w:type="dxa" w:w="100"/>
+              <w:bottom w:type="dxa" w:w="60"/>
+              <w:right w:type="dxa" w:w="100"/>
+            </w:tcMar>
+          </w:tcPr>
+          <w:p>
+            <w:r>
+              <w:rPr>
+                <w:rFonts w:ascii="Arial" w:cs="Arial" w:eastAsia="Arial" w:hAnsi="Arial"/>
+                <w:sz w:val="20"/>
+                <w:szCs w:val="20"/>
+              </w:rPr>
+              <w:t>URS-VIZ-09 not met</w:t>
+            </w:r>
+          </w:p>
+        </w:tc>
+        <w:tc>
+          <w:tcPr>
+            <w:tcW w:type="dxa" w:w="800"/>
+            <w:tcBorders>
+              <w:top w:val="single" w:color="999999" w:sz="1"/>
+              <w:left w:val="single" w:color="999999" w:sz="1"/>
+              <w:bottom w:val="single" w:color="999999" w:sz="1"/>
+              <w:right w:val="single" w:color="999999" w:sz="1"/>
+            </w:tcBorders>
+            <w:tcMar>
+              <w:top w:type="dxa" w:w="60"/>
+              <w:left w:type="dxa" w:w="100"/>
+              <w:bottom w:type="dxa" w:w="60"/>
+              <w:right w:type="dxa" w:w="100"/>
+            </w:tcMar>
+          </w:tcPr>
+          <w:p>
+            <w:r>
+              <w:rPr>
+                <w:rFonts w:ascii="Arial" w:cs="Arial" w:eastAsia="Arial" w:hAnsi="Arial"/>
+                <w:sz w:val="20"/>
+                <w:szCs w:val="20"/>
+              </w:rPr>
+              <w:t>2</w:t>
+            </w:r>
+          </w:p>
+        </w:tc>
+        <w:tc>
+          <w:tcPr>
+            <w:tcW w:type="dxa" w:w="800"/>
+            <w:tcBorders>
+              <w:top w:val="single" w:color="999999" w:sz="1"/>
+              <w:left w:val="single" w:color="999999" w:sz="1"/>
+              <w:bottom w:val="single" w:color="999999" w:sz="1"/>
+              <w:right w:val="single" w:color="999999" w:sz="1"/>
+            </w:tcBorders>
+            <w:tcMar>
+              <w:top w:type="dxa" w:w="60"/>
+              <w:left w:type="dxa" w:w="100"/>
+              <w:bottom w:type="dxa" w:w="60"/>
+              <w:right w:type="dxa" w:w="100"/>
+            </w:tcMar>
+          </w:tcPr>
+          <w:p>
+            <w:r>
+              <w:rPr>
+                <w:rFonts w:ascii="Arial" w:cs="Arial" w:eastAsia="Arial" w:hAnsi="Arial"/>
+                <w:sz w:val="20"/>
+                <w:szCs w:val="20"/>
+              </w:rPr>
+              <w:t>2</w:t>
+            </w:r>
+          </w:p>
+        </w:tc>
+        <w:tc>
+          <w:tcPr>
+            <w:tcW w:type="dxa" w:w="800"/>
+            <w:tcBorders>
+              <w:top w:val="single" w:color="999999" w:sz="1"/>
+              <w:left w:val="single" w:color="999999" w:sz="1"/>
+              <w:bottom w:val="single" w:color="999999" w:sz="1"/>
+              <w:right w:val="single" w:color="999999" w:sz="1"/>
+            </w:tcBorders>
+            <w:tcMar>
+              <w:top w:type="dxa" w:w="60"/>
+              <w:left w:type="dxa" w:w="100"/>
+              <w:bottom w:type="dxa" w:w="60"/>
+              <w:right w:type="dxa" w:w="100"/>
+            </w:tcMar>
+          </w:tcPr>
+          <w:p>
+            <w:r>
+              <w:rPr>
+                <w:rFonts w:ascii="Arial" w:cs="Arial" w:eastAsia="Arial" w:hAnsi="Arial"/>
+                <w:sz w:val="20"/>
+                <w:szCs w:val="20"/>
+              </w:rPr>
+              <w:t>2</w:t>
+            </w:r>
+          </w:p>
+        </w:tc>
+        <w:tc>
+          <w:tcPr>
+            <w:tcW w:type="dxa" w:w="800"/>
+            <w:tcBorders>
+              <w:top w:val="single" w:color="999999" w:sz="1"/>
+              <w:left w:val="single" w:color="999999" w:sz="1"/>
+              <w:bottom w:val="single" w:color="999999" w:sz="1"/>
+              <w:right w:val="single" w:color="999999" w:sz="1"/>
+            </w:tcBorders>
+            <w:tcMar>
+              <w:top w:type="dxa" w:w="60"/>
+              <w:left w:type="dxa" w:w="100"/>
+              <w:bottom w:type="dxa" w:w="60"/>
+              <w:right w:type="dxa" w:w="100"/>
+            </w:tcMar>
+          </w:tcPr>
+          <w:p>
+            <w:r>
+              <w:rPr>
+                <w:rFonts w:ascii="Arial" w:cs="Arial" w:eastAsia="Arial" w:hAnsi="Arial"/>
+                <w:sz w:val="20"/>
+                <w:szCs w:val="20"/>
+              </w:rPr>
+              <w:t>8</w:t>
+            </w:r>
+          </w:p>
+        </w:tc>
+        <w:tc>
+          <w:tcPr>
+            <w:tcW w:type="dxa" w:w="1800"/>
+            <w:tcBorders>
+              <w:top w:val="single" w:color="999999" w:sz="1"/>
+              <w:left w:val="single" w:color="999999" w:sz="1"/>
+              <w:bottom w:val="single" w:color="999999" w:sz="1"/>
+              <w:right w:val="single" w:color="999999" w:sz="1"/>
+            </w:tcBorders>
+            <w:tcMar>
+              <w:top w:type="dxa" w:w="60"/>
+              <w:left w:type="dxa" w:w="100"/>
+              <w:bottom w:type="dxa" w:w="60"/>
+              <w:right w:type="dxa" w:w="100"/>
+            </w:tcMar>
+          </w:tcPr>
+          <w:p>
+            <w:r>
+              <w:rPr>
+                <w:rFonts w:ascii="Arial" w:cs="Arial" w:eastAsia="Arial" w:hAnsi="Arial"/>
+                <w:sz w:val="20"/>
+                <w:szCs w:val="20"/>
+              </w:rPr>
+              <w:t>Validation tests for URS-VIZ-09</w:t>
+            </w:r>
+          </w:p>
+        </w:tc>
+      </w:tr>
     </w:tbl>
     <w:p>
       <w:r>
@@ -23151,6 +23342,150 @@
                 <w:szCs w:val="20"/>
               </w:rPr>
               <w:t xml:space="preserve">FM-VIZ-08</w:t>
+            </w:r>
+          </w:p>
+        </w:tc>
+      </w:tr>
+      <w:tr>
+        <w:tc>
+          <w:tcPr>
+            <w:tcW w:type="dxa" w:w="1200"/>
+            <w:tcBorders>
+              <w:top w:val="single" w:color="999999" w:sz="1"/>
+              <w:left w:val="single" w:color="999999" w:sz="1"/>
+              <w:bottom w:val="single" w:color="999999" w:sz="1"/>
+              <w:right w:val="single" w:color="999999" w:sz="1"/>
+            </w:tcBorders>
+            <w:shd w:fill="F7F9FC" w:val="clear"/>
+            <w:tcMar>
+              <w:top w:type="dxa" w:w="60"/>
+              <w:left w:type="dxa" w:w="100"/>
+              <w:bottom w:type="dxa" w:w="60"/>
+              <w:right w:type="dxa" w:w="100"/>
+            </w:tcMar>
+          </w:tcPr>
+          <w:p>
+            <w:r>
+              <w:rPr>
+                <w:rFonts w:ascii="Arial" w:cs="Arial" w:eastAsia="Arial" w:hAnsi="Arial"/>
+                <w:b/>
+                <w:bCs/>
+                <w:sz w:val="20"/>
+                <w:szCs w:val="20"/>
+              </w:rPr>
+              <w:t>URS-VIZ-09</w:t>
+            </w:r>
+          </w:p>
+        </w:tc>
+        <w:tc>
+          <w:tcPr>
+            <w:tcW w:type="dxa" w:w="3600"/>
+            <w:tcBorders>
+              <w:top w:val="single" w:color="999999" w:sz="1"/>
+              <w:left w:val="single" w:color="999999" w:sz="1"/>
+              <w:bottom w:val="single" w:color="999999" w:sz="1"/>
+              <w:right w:val="single" w:color="999999" w:sz="1"/>
+            </w:tcBorders>
+            <w:shd w:fill="F7F9FC" w:val="clear"/>
+            <w:tcMar>
+              <w:top w:type="dxa" w:w="60"/>
+              <w:left w:type="dxa" w:w="100"/>
+              <w:bottom w:type="dxa" w:w="60"/>
+              <w:right w:type="dxa" w:w="100"/>
+            </w:tcMar>
+          </w:tcPr>
+          <w:p>
+            <w:r>
+              <w:rPr>
+                <w:rFonts w:ascii="Arial" w:cs="Arial" w:eastAsia="Arial" w:hAnsi="Arial"/>
+                <w:sz w:val="20"/>
+                <w:szCs w:val="20"/>
+              </w:rPr>
+              <w:t>The Visualize module shall produce a Figure Record: the exported figure, the figure settings, a standalone script that rebuilds the figure from the source data with the shipped pipeline, an integrity manifest and an HTML summary. Partial AUC intervals shaded on the figure shall be reproduced by that script.</w:t>
+            </w:r>
+          </w:p>
+        </w:tc>
+        <w:tc>
+          <w:tcPr>
+            <w:tcW w:type="dxa" w:w="2960"/>
+            <w:tcBorders>
+              <w:top w:val="single" w:color="999999" w:sz="1"/>
+              <w:left w:val="single" w:color="999999" w:sz="1"/>
+              <w:bottom w:val="single" w:color="999999" w:sz="1"/>
+              <w:right w:val="single" w:color="999999" w:sz="1"/>
+            </w:tcBorders>
+            <w:shd w:fill="F7F9FC" w:val="clear"/>
+            <w:tcMar>
+              <w:top w:type="dxa" w:w="60"/>
+              <w:left w:type="dxa" w:w="100"/>
+              <w:bottom w:type="dxa" w:w="60"/>
+              <w:right w:type="dxa" w:w="100"/>
+            </w:tcMar>
+          </w:tcPr>
+          <w:p>
+            <w:r>
+              <w:rPr>
+                <w:rFonts w:ascii="Arial" w:cs="Arial" w:eastAsia="Arial" w:hAnsi="Arial"/>
+                <w:sz w:val="20"/>
+                <w:szCs w:val="20"/>
+              </w:rPr>
+              <w:t>The record contains the figure, figure_settings.json, reproduce_figure.R, nca_pipeline.R, the integrity manifest and the HTML summary; running the script rebuilds the figure, including the shaded intervals.</w:t>
+            </w:r>
+          </w:p>
+        </w:tc>
+        <w:tc>
+          <w:tcPr>
+            <w:tcW w:type="dxa" w:w="800"/>
+            <w:tcBorders>
+              <w:top w:val="single" w:color="999999" w:sz="1"/>
+              <w:left w:val="single" w:color="999999" w:sz="1"/>
+              <w:bottom w:val="single" w:color="999999" w:sz="1"/>
+              <w:right w:val="single" w:color="999999" w:sz="1"/>
+            </w:tcBorders>
+            <w:shd w:fill="F7F9FC" w:val="clear"/>
+            <w:tcMar>
+              <w:top w:type="dxa" w:w="60"/>
+              <w:left w:type="dxa" w:w="100"/>
+              <w:bottom w:type="dxa" w:w="60"/>
+              <w:right w:type="dxa" w:w="100"/>
+            </w:tcMar>
+          </w:tcPr>
+          <w:p>
+            <w:r>
+              <w:rPr>
+                <w:rFonts w:ascii="Arial" w:cs="Arial" w:eastAsia="Arial" w:hAnsi="Arial"/>
+                <w:sz w:val="20"/>
+                <w:szCs w:val="20"/>
+              </w:rPr>
+              <w:t>Low</w:t>
+            </w:r>
+          </w:p>
+        </w:tc>
+        <w:tc>
+          <w:tcPr>
+            <w:tcW w:type="dxa" w:w="800"/>
+            <w:tcBorders>
+              <w:top w:val="single" w:color="999999" w:sz="1"/>
+              <w:left w:val="single" w:color="999999" w:sz="1"/>
+              <w:bottom w:val="single" w:color="999999" w:sz="1"/>
+              <w:right w:val="single" w:color="999999" w:sz="1"/>
+            </w:tcBorders>
+            <w:shd w:fill="F7F9FC" w:val="clear"/>
+            <w:tcMar>
+              <w:top w:type="dxa" w:w="60"/>
+              <w:left w:type="dxa" w:w="100"/>
+              <w:bottom w:type="dxa" w:w="60"/>
+              <w:right w:type="dxa" w:w="100"/>
+            </w:tcMar>
+          </w:tcPr>
+          <w:p>
+            <w:r>
+              <w:rPr>
+                <w:rFonts w:ascii="Arial" w:cs="Arial" w:eastAsia="Arial" w:hAnsi="Arial"/>
+                <w:sz w:val="20"/>
+                <w:szCs w:val="20"/>
+              </w:rPr>
+              <w:t>FM-VIZ-09</w:t>
             </w:r>
           </w:p>
         </w:tc>
@@ -23322,6 +23657,19 @@
           <w:szCs w:val="22"/>
         </w:rPr>
         <w:t>FDA product-specific guidances defining partial AUC metrics; Hopefl R et al., Clin Pharmacol Ther 2025;117:1185-93</w:t>
+      </w:r>
+    </w:p>
+    <w:p>
+      <w:pPr>
+        <w:spacing w:after="120"/>
+      </w:pPr>
+      <w:r>
+        <w:rPr>
+          <w:rFonts w:ascii="Arial" w:cs="Arial" w:eastAsia="Arial" w:hAnsi="Arial"/>
+          <w:sz w:val="22"/>
+          <w:szCs w:val="22"/>
+        </w:rPr>
+        <w:t>EMA Guideline on the pharmacokinetic and clinical evaluation of modified release dosage forms, EMA/CHMP/EWP/280/96 Rev1 (2014)</w:t>
       </w:r>
     </w:p>
     <w:p>

</xml_diff>

<commit_message>
T10: release files for v1.8.0 and user manual 1.9
APP_VERSION 1.8.0, version history, README and validation README headers,
citation. Manual renamed to 1.9 (title page, header, document control,
TOC updated, PDF exported from Word); header link follows. URS and
protocol carry v1.8.0. Release manifest and renv.lock regenerated
(adds shinymanager, DBI, RSQLite and their dependencies); protocol
rebuilt from a green run: 475 automated tests pass, 62 manual, URS 89/89.

Co-Authored-By: Claude Opus 5.5 <noreply@anthropic.com>
</commit_message>
<xml_diff>
--- a/validation/NCA_Assistant_URS.docx
+++ b/validation/NCA_Assistant_URS.docx
@@ -411,7 +411,7 @@
           <w:sz w:val="22"/>
           <w:szCs w:val="22"/>
         </w:rPr>
-        <w:t>This User Requirement Specification defines the functional and quality requirements for NCA Assistant vX.Y.Z, an open-source R/Shiny application for pharmacokinetic non-compartmental analysis, bioequivalence testing, data visualization, and study planning.</w:t>
+        <w:t>This User Requirement Specification defines the functional and quality requirements for NCA Assistant v1.8.0, an open-source R/Shiny application for pharmacokinetic non-compartmental analysis, bioequivalence testing, data visualization, and study planning.</w:t>
       </w:r>
     </w:p>
     <w:p>
@@ -448,7 +448,7 @@
           <w:sz w:val="22"/>
           <w:szCs w:val="22"/>
         </w:rPr>
-        <w:t>NCA Assistant vX.Y.Z provides six workflow paths accessible from a central hub: (1) Plan a Study, (2) Upload &amp; Check Data (flat files, or CDISC ADNCA datasets through a separate upload option), (3) Visualize Data, (4) Analyze One Subject at a Time, (5) Analyze All Subjects, (6) Bioequivalence Testing. Paths 4, 5 and 6 also report partial AUCs over intervals entered by the user, and path 6 compares them. The data-processing pipeline (R/pipeline.R) is shared by the app, the validation script and the reproduction scripts shipped in every Analysis Record. GAMP 5 Category 5 custom application. The app performs average bioequivalence only; it does not perform reference-scaled (ABEL, RSABE) or NTID analyses, which Plan a Study can plan. It is not affiliated with, endorsed by, or certified by CDISC.</w:t>
+        <w:t>NCA Assistant v1.8.0 provides six workflow paths accessible from a central hub: (1) Plan a Study, (2) Upload &amp; Check Data (flat files, or CDISC ADNCA datasets through a separate upload option), (3) Visualize Data, (4) Analyze One Subject at a Time, (5) Analyze All Subjects, (6) Bioequivalence Testing. Paths 4, 5 and 6 also report partial AUCs over intervals entered by the user, and path 6 compares them. The data-processing pipeline (R/pipeline.R) is shared by the app, the validation script and the reproduction scripts shipped in every Analysis Record. GAMP 5 Category 5 custom application. The app performs average bioequivalence only; it does not perform reference-scaled (ABEL, RSABE) or NTID analyses, which Plan a Study can plan. It is not affiliated with, endorsed by, or certified by CDISC.</w:t>
       </w:r>
     </w:p>
     <w:p>
@@ -24907,6 +24907,7 @@
     <w:sectPr>
       <w:headerReference w:type="default" r:id="rId7"/>
       <w:footerReference w:type="default" r:id="rId8"/>
+      <w:headerReference w:type="first" r:id="rId10"/>
       <w:pgSz w:w="12240" w:h="15840" w:orient="portrait"/>
       <w:pgMar w:top="1440" w:right="1440" w:bottom="1440" w:left="1440" w:header="708" w:footer="708" w:gutter="0"/>
       <w:pgNumType/>
@@ -25038,6 +25039,16 @@
       </w:rPr>
       <w:t xml:space="preserve">NCA Assistant — User Requirement Specification</w:t>
     </w:r>
+  </w:p>
+</w:hdr>
+</file>
+
+<file path=word/header2.xml><?xml version="1.0" encoding="utf-8"?>
+<w:hdr xmlns:m="http://schemas.openxmlformats.org/officeDocument/2006/math" xmlns:mc="http://schemas.openxmlformats.org/markup-compatibility/2006" xmlns:mo="http://schemas.microsoft.com/office/mac/office/2008/main" xmlns:mv="urn:schemas-microsoft-com:mac:vml" xmlns:o="urn:schemas-microsoft-com:office:office" xmlns:r="http://schemas.openxmlformats.org/officeDocument/2006/relationships" xmlns:v="urn:schemas-microsoft-com:vml" xmlns:w10="urn:schemas-microsoft-com:office:word" xmlns:w14="http://schemas.microsoft.com/office/word/2010/wordml" xmlns:w="http://schemas.openxmlformats.org/wordprocessingml/2006/main" xmlns:wne="http://schemas.microsoft.com/office/word/2006/wordml" xmlns:wp14="http://schemas.microsoft.com/office/word/2010/wordprocessingDrawing" xmlns:wp="http://schemas.openxmlformats.org/drawingml/2006/wordprocessingDrawing" xmlns:wpc="http://schemas.microsoft.com/office/word/2010/wordprocessingCanvas" xmlns:wpg="http://schemas.microsoft.com/office/word/2010/wordprocessingGroup" xmlns:wpi="http://schemas.microsoft.com/office/word/2010/wordprocessingInk" xmlns:wps="http://schemas.microsoft.com/office/word/2010/wordprocessingShape" mc:Ignorable="w14 wp14">
+  <w:p>
+    <w:pPr>
+      <w:pStyle w:val="Header"/>
+    </w:pPr>
   </w:p>
 </w:hdr>
 </file>

</xml_diff>

<commit_message>
Docs and release files for the data and statistics review
- URS: acceptance criteria of DAT-01, DAT-03, NCA-06, NCA-08, BE-10 and
  VIZ-05 cover D-1..D-8 and the ADNCA APERIOD fix; DSR tests added to the
  FMEA controls. Still 89 requirements.
- IQ/OQ/PQ protocol regenerated: new section 3.22 (DSR, 9 tests).
- Manual 1.9: negative pre-dose times refused, 0.250 in a decimal-comma
  file, several analytes refused, mean-profile rules, dose-normalised
  steady-state metrics, single-measurable profiles kept, partial AUCs
  past Tlast in BE. PDF re-exported from Word.
- README and validation/README: 503 automated tests, 366 CRITICAL and
  137 SUPPORTIVE, the DSR section. Release manifest regenerated.

Green run: 503/503 automated (62 manual), URS 89/89, UTF-8 and C locales.

Co-Authored-By: Claude Opus 5.5 <noreply@anthropic.com>
</commit_message>
<xml_diff>
--- a/validation/NCA_Assistant_URS.docx
+++ b/validation/NCA_Assistant_URS.docx
@@ -1166,7 +1166,7 @@
                 <w:sz w:val="20"/>
                 <w:szCs w:val="20"/>
               </w:rPr>
-              <w:t>A point is a thousands separator in decimal-comma files and any other point is refused; Excel and CSV are read as text first; Latin-1 fallback for non-UTF-8 files. Tests: IL-DEC-01, IL-DEC-02, REL-07, REL-08, REL-21, REL-54</w:t>
+              <w:t>A point is a thousands separator in decimal-comma files and any other point is refused; Excel and CSV are read as text first; Latin-1 fallback for non-UTF-8 files. Tests: IL-DEC-01, IL-DEC-02, REL-07, REL-08, REL-21, REL-54, DSR-01, DSR-08</w:t>
             </w:r>
           </w:p>
         </w:tc>
@@ -1548,7 +1548,7 @@
                 <w:sz w:val="20"/>
                 <w:szCs w:val="20"/>
               </w:rPr>
-              <w:t>A profile is subject x treatment x period; a subject in two sequences and restarting IDs are errors; stacked profiles refused; two periods in one profile flagged. Tests: REP-PC-01, REP-PC-03, REL-09, REL-10, REL-24, REV-07</w:t>
+              <w:t>A profile is subject x treatment x period; a subject in two sequences and restarting IDs are errors; stacked profiles refused; two periods in one profile flagged. Tests: REP-PC-01, REP-PC-03, REL-09, REL-10, REL-24, REV-07, DSR-05</w:t>
             </w:r>
           </w:p>
         </w:tc>
@@ -1930,7 +1930,7 @@
                 <w:sz w:val="20"/>
                 <w:szCs w:val="20"/>
               </w:rPr>
-              <w:t>Corrections around known NonCompart limitations; analytical ground truth; an independent trapezoid calculation for every theophylline profile; hand-calculated partial AUCs. Tests: NCA-GT-04, NCA-TR-01, REL-01, REL-03, REL-05, REL-30, PAUC-02</w:t>
+              <w:t>Corrections around known NonCompart limitations; analytical ground truth; an independent trapezoid calculation for every theophylline profile; hand-calculated partial AUCs. Tests: NCA-GT-04, NCA-TR-01, REL-01, REL-03, REL-05, REL-30, PAUC-02, DSR-04</w:t>
             </w:r>
           </w:p>
         </w:tc>
@@ -2312,7 +2312,7 @@
                 <w:sz w:val="20"/>
                 <w:szCs w:val="20"/>
               </w:rPr>
-              <w:t>Doses matched by profile, never by position; an ambiguous dose vector is refused; varying doses give a warning. Tests: REG-DOSE-01, REG-DOSE-02, REG-DOSE-03, REV-01, REL-48, ADV-05</w:t>
+              <w:t>Doses matched by profile, never by position; an ambiguous dose vector is refused; varying doses give a warning. Tests: REG-DOSE-01, REG-DOSE-02, REG-DOSE-03, REV-01, REL-48, ADV-05, DSR-07</w:t>
             </w:r>
           </w:p>
         </w:tc>
@@ -3458,7 +3458,7 @@
                 <w:sz w:val="20"/>
                 <w:szCs w:val="20"/>
               </w:rPr>
-              <w:t>Zero values suppress that metric; supportive metrics, half-life and Tmax get no verdict; ICH M13A checks are listed with the results. Tests: PAUC-12, REV3-14, REG-BE-UT-01, REL-19</w:t>
+              <w:t>Zero values suppress that metric; supportive metrics, half-life and Tmax get no verdict; ICH M13A checks are listed with the results. Tests: PAUC-12, REV3-14, REG-BE-UT-01, REL-19, DSR-02, DSR-03</w:t>
             </w:r>
           </w:p>
         </w:tc>
@@ -5177,7 +5177,7 @@
                 <w:sz w:val="20"/>
                 <w:szCs w:val="20"/>
               </w:rPr>
-              <w:t>Lines per profile; geometric statistics by default and arithmetic ones labelled; values of zero or below counted and reported. Tests: VIZ-02, VIZ-03, REL-25, REL-41</w:t>
+              <w:t>Lines per profile; geometric statistics by default and arithmetic ones labelled; values of zero or below counted and reported. Tests: VIZ-02, VIZ-03, REL-25, REL-41, DSR-06</w:t>
             </w:r>
           </w:p>
         </w:tc>
@@ -5559,7 +5559,7 @@
                 <w:sz w:val="20"/>
                 <w:szCs w:val="20"/>
               </w:rPr>
-              <w:t>The time variable must be chosen; DTYPE records and unsupported structures are refused; ANL01FL applied; the choices are recorded. Tests: CONV-02, CONV-03, CONV-04, EQV-01, ADNCA-02</w:t>
+              <w:t>The time variable must be chosen; DTYPE records and unsupported structures are refused; ANL01FL applied; the choices are recorded. Tests: CONV-02, CONV-03, CONV-04, EQV-01, ADNCA-02, DSR-09</w:t>
             </w:r>
           </w:p>
         </w:tc>
@@ -10277,7 +10277,7 @@
                 <w:sz w:val="20"/>
                 <w:szCs w:val="20"/>
               </w:rPr>
-              <w:t>Flat files load without error and decimal-comma numbers stored as text are read; an ADNCA dataset is converted only with an explicit time variable (NRRLT, ARRLT or MRRLT; AFRLT refused), ANL01FL applied, derived records (DTYPE) refused, one analyte and matrix, and the choices recorded; the standalone converter uses the same code.</w:t>
+              <w:t>Flat files load without error and decimal-comma numbers stored as text are read; an ADNCA dataset is converted only with an explicit time variable (NRRLT, ARRLT or MRRLT; AFRLT refused), ANL01FL applied, derived records (DTYPE) refused, one analyte and matrix, and the choices recorded; the standalone converter uses the same code; in a decimal-comma file a point value that cannot be a thousands separator (0.250, 0.25) is refused; a UTF-8 byte-order mark is not part of the first column name; an ADNCA dataset without APERIOD converts.</w:t>
             </w:r>
           </w:p>
         </w:tc>
@@ -10560,7 +10560,7 @@
                 <w:sz w:val="20"/>
                 <w:szCs w:val="20"/>
               </w:rPr>
-              <w:t>run_data_quality_check returns structured findings; ERRORs block processing; CDISC-shaped flat files, mixed units, dates or clock times as time, profiles not starting near time zero, stacked profiles, subject IDs that restart per sequence, a subject in two sequences, a decimal point in a decimal-comma file and a negative concentration without an LLOQ are refused; a second dose inside a profile and an unmapped Period give a warning; an empty LLOQ is reported, not a crash.</w:t>
+              <w:t>run_data_quality_check returns structured findings; ERRORs block processing; CDISC-shaped flat files, mixed units, dates or clock times as time, profiles not starting near time zero, stacked profiles, subject IDs that restart per sequence, a subject in two sequences, a decimal point in a decimal-comma file and a negative concentration without an LLOQ are refused; a second dose inside a profile and an unmapped Period give a warning; an empty LLOQ is reported, not a crash; negative (pre-dose) times and an unmapped Analyte, PARAMCD or Matrix column that changes within a subject are ERRORs.</w:t>
             </w:r>
           </w:p>
         </w:tc>
@@ -12313,7 +12313,7 @@
                 <w:sz w:val="20"/>
                 <w:szCs w:val="20"/>
               </w:rPr>
-              <w:t>tblNCA returns one row per profile; replicate administrations are separate profiles; summary statistics are given per treatment on screen, in the Excel download and in the Analysis Record.</w:t>
+              <w:t>tblNCA returns one row per profile; replicate administrations are separate profiles; summary statistics are given per treatment on screen, in the Excel download and in the Analysis Record; a profile with one measurable concentration gets Cmax, Tmax and AUClast.</w:t>
             </w:r>
           </w:p>
         </w:tc>
@@ -12596,7 +12596,7 @@
                 <w:sz w:val="20"/>
                 <w:szCs w:val="20"/>
               </w:rPr>
-              <w:t>CMAX_DN = CMAX/dose of that profile; all expected DN columns created.</w:t>
+              <w:t>CMAX_DN = CMAX/dose of that profile; all expected DN columns created; at steady state AUCtau, Cavg, Cmin and Ctau are dose-normalised too.</w:t>
             </w:r>
           </w:p>
         </w:tc>
@@ -15071,7 +15071,7 @@
                 <w:sz w:val="20"/>
                 <w:szCs w:val="20"/>
               </w:rPr>
-              <w:t>The confidence interval equals lm() on the log values and agrees with replicateBE for a replicate design; supportive metrics show ratio and CI without a verdict; a zero suppresses that metric only, which keeps its row with the counts of zero and missing profiles per treatment.</w:t>
+              <w:t>The confidence interval equals lm() on the log values and agrees with replicateBE for a replicate design; supportive metrics show ratio and CI without a verdict; a zero suppresses that metric only, which keeps its row with the counts of zero and missing profiles per treatment; a partial AUC that is missing because the interval passes a profile's last measurable concentration gives no estimate and no verdict.</w:t>
             </w:r>
           </w:p>
         </w:tc>
@@ -19412,7 +19412,7 @@
                 <w:sz w:val="20"/>
                 <w:szCs w:val="20"/>
               </w:rPr>
-              <w:t xml:space="preserve">Exclusion count shown; GM computed on positives only.</w:t>
+              <w:t>Exclusion count shown; GM computed on positives only; a time point where more than half of the concentrations are &lt;= 0 gets no geometric mean, and differing sampling times between profiles are reported.</w:t>
             </w:r>
           </w:p>
         </w:tc>

</xml_diff>